<commit_message>
docs: correct stale claims about GraphStore and contract wording
GraphStore now exists with SQLite, Neo4j and in-memory backends; update
AGENTS.md, graph_store.py and related docs that described it as a future
target. Tighten canonical-digest, deprecations and PR impact wording so
empty results are not read as permission or safety verdicts.
</commit_message>
<xml_diff>
--- a/docs/future/evidence-compiler-strategy.docx
+++ b/docs/future/evidence-compiler-strategy.docx
@@ -7,21 +7,21 @@
         <w:pStyle w:val="Title"/>
       </w:pPr>
       <w:r>
-        <w:t>TraceKite strategy for lower cost coding agents</w:t>
+        <w:t>TraceKite verification and context strategy</w:t>
       </w:r>
     </w:p>
     <w:p>
       <w:r>
-        <w:t xml:space="preserve">TraceKite should develop an </w:t>
+        <w:t xml:space="preserve">TraceKite should build </w:t>
       </w:r>
       <w:r>
         <w:rPr>
           <w:b/>
         </w:rPr>
-        <w:t>Evidence Compiler</w:t>
+        <w:t>one shared evidence foundation</w:t>
       </w:r>
       <w:r>
-        <w:t xml:space="preserve"> for coding agents: a system that turns a requested change into a small set of explicit questions, answers the supported questions from source evidence, and supplies more code only when the task requires it. Its purpose is to reduce the total cost of a correctly completed change while making missing and outdated information visible.</w:t>
+        <w:t xml:space="preserve"> for structural claim verification and economical coding-task context. Deliver the verifier first, reusing existing scan/link/PR analysis. Add an Evidence Compiler as an optional adapter if quality and cost experiments justify it. Both uses must expose missing and outdated evidence; neither establishes general runtime safety.</w:t>
       </w:r>
     </w:p>
     <w:p>
@@ -39,7 +39,7 @@
     </w:p>
     <w:p>
       <w:r>
-        <w:t xml:space="preserve">Build a </w:t>
+        <w:t xml:space="preserve">For the optional compiler, prototype the </w:t>
       </w:r>
       <w:r>
         <w:rPr>
@@ -48,7 +48,7 @@
         <w:t>Rendezvous Witness Compiler</w:t>
       </w:r>
       <w:r>
-        <w:t>, or RWC, as the research kernel behind the Evidence Compiler. A witness is the provider, consumer and configuration evidence supporting a connection. The compiler should preserve these witnesses, track unresolved questions, and watch the inputs that could change an answer, including the arrival of a previously unseen consumer.</w:t>
+        <w:t>, or RWC, over shared analysis receipts. A witness is the provider, consumer and configuration evidence supporting a connection. Selection must preserve these witnesses, track unresolved questions, and watch inputs that could change an answer, including previously unseen consumers. RWC is not a second graph or verification engine.</w:t>
       </w:r>
     </w:p>
     <w:p>
@@ -83,7 +83,7 @@
     </w:p>
     <w:p>
       <w:r>
-        <w:t xml:space="preserve">Start with a narrow adoption gate: target at least </w:t>
+        <w:t xml:space="preserve">For the compiler, target at least </w:t>
       </w:r>
       <w:r>
         <w:rPr>
@@ -92,7 +92,7 @@
         <w:t>30 percent lower cost per accepted task</w:t>
       </w:r>
       <w:r>
-        <w:t xml:space="preserve"> on the initial workload, measured against the strongest affordable baseline. Require a predeclared quality margin and publish failures. If only the serialized tool response becomes smaller, the central product claim has not been established.</w:t>
+        <w:t xml:space="preserve"> against a baseline with the same verification policy. Require a predeclared quality margin and publish failures. Measure the verifier's correctness and review value separately. Smaller serialized responses alone do not establish either product benefit.</w:t>
       </w:r>
     </w:p>
     <w:p>
@@ -111,6 +111,508 @@
     <w:p>
       <w:r>
         <w:t>An open-source advantage must survive inspection. Keep the kernel, receipt validator and benchmark public. Build defensibility through cross-repository coverage, integration quality, difficult regression fixtures and measured economics. A hidden ranking formula would provide a weaker foundation for trust.</w:t>
+      </w:r>
+    </w:p>
+    <w:p>
+      <w:pPr>
+        <w:pStyle w:val="Heading1"/>
+        <w:pageBreakBefore/>
+      </w:pPr>
+      <w:r>
+        <w:t>Verification and context compilation</w:t>
+      </w:r>
+    </w:p>
+    <w:p>
+      <w:r>
+        <w:t xml:space="preserve">The </w:t>
+      </w:r>
+      <w:hyperlink r:id="rId10">
+        <w:r>
+          <w:rPr>
+            <w:color w:val="254C69"/>
+            <w:u w:val="single"/>
+          </w:rPr>
+          <w:t xml:space="preserve">agent verification design</w:t>
+        </w:r>
+      </w:hyperlink>
+      <w:r>
+        <w:t xml:space="preserve"> defines the proposed shared receipt contract and verification boundary. This strategy covers optional context selection and its economics. Keep both documents as views of one plan, not specifications for separate evidence systems.</w:t>
+      </w:r>
+    </w:p>
+    <w:tbl>
+      <w:tblPr>
+        <w:tblW w:type="auto" w:w="0"/>
+        <w:tblLayout w:type="fixed"/>
+        <w:tblLook w:firstColumn="1" w:firstRow="1" w:lastColumn="0" w:lastRow="0" w:noHBand="0" w:noVBand="1" w:val="04A0"/>
+        <w:tblBorders>
+          <w:top w:val="single" w:sz="4" w:color="D9D9D9"/>
+          <w:left w:val="single" w:sz="4" w:color="D9D9D9"/>
+          <w:bottom w:val="single" w:sz="4" w:color="D9D9D9"/>
+          <w:right w:val="single" w:sz="4" w:color="D9D9D9"/>
+          <w:insideH w:val="single" w:sz="4" w:color="D9D9D9"/>
+          <w:insideV w:val="single" w:sz="4" w:color="D9D9D9"/>
+        </w:tblBorders>
+        <w:tblCellMar>
+          <w:top w:w="75" w:type="dxa"/>
+          <w:bottom w:w="75" w:type="dxa"/>
+          <w:left w:w="85" w:type="dxa"/>
+          <w:right w:w="85" w:type="dxa"/>
+        </w:tblCellMar>
+      </w:tblPr>
+      <w:tblGrid>
+        <w:gridCol w:w="2088"/>
+        <w:gridCol w:w="4032"/>
+        <w:gridCol w:w="4104"/>
+      </w:tblGrid>
+      <w:tr>
+        <w:trPr>
+          <w:cantSplit/>
+          <w:tblHeader/>
+        </w:trPr>
+        <w:tc>
+          <w:tcPr>
+            <w:tcW w:type="dxa" w:w="2088"/>
+            <w:vAlign w:val="center"/>
+            <w:shd w:fill="303942"/>
+          </w:tcPr>
+          <w:p>
+            <w:pPr>
+              <w:spacing w:after="0" w:line="254" w:lineRule="auto"/>
+            </w:pPr>
+            <w:r>
+              <w:rPr>
+                <w:b/>
+                <w:color w:val="FFFFFF"/>
+                <w:sz w:val="20"/>
+              </w:rPr>
+              <w:t>Dimension</w:t>
+            </w:r>
+          </w:p>
+        </w:tc>
+        <w:tc>
+          <w:tcPr>
+            <w:tcW w:type="dxa" w:w="4032"/>
+            <w:vAlign w:val="center"/>
+            <w:shd w:fill="303942"/>
+          </w:tcPr>
+          <w:p>
+            <w:pPr>
+              <w:spacing w:after="0" w:line="254" w:lineRule="auto"/>
+            </w:pPr>
+            <w:r>
+              <w:rPr>
+                <w:b/>
+                <w:color w:val="FFFFFF"/>
+                <w:sz w:val="20"/>
+              </w:rPr>
+              <w:t>Verification layer</w:t>
+            </w:r>
+          </w:p>
+        </w:tc>
+        <w:tc>
+          <w:tcPr>
+            <w:tcW w:type="dxa" w:w="4104"/>
+            <w:vAlign w:val="center"/>
+            <w:shd w:fill="303942"/>
+          </w:tcPr>
+          <w:p>
+            <w:pPr>
+              <w:spacing w:after="0" w:line="254" w:lineRule="auto"/>
+            </w:pPr>
+            <w:r>
+              <w:rPr>
+                <w:b/>
+                <w:color w:val="FFFFFF"/>
+                <w:sz w:val="20"/>
+              </w:rPr>
+              <w:t>Evidence Compiler</w:t>
+            </w:r>
+          </w:p>
+        </w:tc>
+      </w:tr>
+      <w:tr>
+        <w:trPr>
+          <w:cantSplit/>
+        </w:trPr>
+        <w:tc>
+          <w:tcPr>
+            <w:tcW w:type="dxa" w:w="2088"/>
+            <w:vAlign w:val="center"/>
+            <w:shd w:fill="FFFFFF"/>
+          </w:tcPr>
+          <w:p>
+            <w:pPr>
+              <w:spacing w:after="0" w:line="254" w:lineRule="auto"/>
+            </w:pPr>
+            <w:r>
+              <w:rPr>
+                <w:sz w:val="20"/>
+              </w:rPr>
+              <w:t>Main question</w:t>
+            </w:r>
+          </w:p>
+        </w:tc>
+        <w:tc>
+          <w:tcPr>
+            <w:tcW w:type="dxa" w:w="4032"/>
+            <w:vAlign w:val="center"/>
+            <w:shd w:fill="FFFFFF"/>
+          </w:tcPr>
+          <w:p>
+            <w:pPr>
+              <w:spacing w:after="0" w:line="254" w:lineRule="auto"/>
+            </w:pPr>
+            <w:r>
+              <w:rPr>
+                <w:sz w:val="20"/>
+              </w:rPr>
+              <w:t>Does a stated structural claim agree with scoped evidence?</w:t>
+            </w:r>
+          </w:p>
+        </w:tc>
+        <w:tc>
+          <w:tcPr>
+            <w:tcW w:type="dxa" w:w="4104"/>
+            <w:vAlign w:val="center"/>
+            <w:shd w:fill="FFFFFF"/>
+          </w:tcPr>
+          <w:p>
+            <w:pPr>
+              <w:spacing w:after="0" w:line="254" w:lineRule="auto"/>
+            </w:pPr>
+            <w:r>
+              <w:rPr>
+                <w:sz w:val="20"/>
+              </w:rPr>
+              <w:t>Which evidence should the coding task receive within its budget?</w:t>
+            </w:r>
+          </w:p>
+        </w:tc>
+      </w:tr>
+      <w:tr>
+        <w:trPr>
+          <w:cantSplit/>
+        </w:trPr>
+        <w:tc>
+          <w:tcPr>
+            <w:tcW w:type="dxa" w:w="2088"/>
+            <w:vAlign w:val="center"/>
+            <w:shd w:fill="F3F5F6"/>
+          </w:tcPr>
+          <w:p>
+            <w:pPr>
+              <w:spacing w:after="0" w:line="254" w:lineRule="auto"/>
+            </w:pPr>
+            <w:r>
+              <w:rPr>
+                <w:sz w:val="20"/>
+              </w:rPr>
+              <w:t>Typical use</w:t>
+            </w:r>
+          </w:p>
+        </w:tc>
+        <w:tc>
+          <w:tcPr>
+            <w:tcW w:type="dxa" w:w="4032"/>
+            <w:vAlign w:val="center"/>
+            <w:shd w:fill="F3F5F6"/>
+          </w:tcPr>
+          <w:p>
+            <w:pPr>
+              <w:spacing w:after="0" w:line="254" w:lineRule="auto"/>
+            </w:pPr>
+            <w:r>
+              <w:rPr>
+                <w:sz w:val="20"/>
+              </w:rPr>
+              <w:t>CI or review after an edit; also pre-edit assertions</w:t>
+            </w:r>
+          </w:p>
+        </w:tc>
+        <w:tc>
+          <w:tcPr>
+            <w:tcW w:type="dxa" w:w="4104"/>
+            <w:vAlign w:val="center"/>
+            <w:shd w:fill="F3F5F6"/>
+          </w:tcPr>
+          <w:p>
+            <w:pPr>
+              <w:spacing w:after="0" w:line="254" w:lineRule="auto"/>
+            </w:pPr>
+            <w:r>
+              <w:rPr>
+                <w:sz w:val="20"/>
+              </w:rPr>
+              <w:t>Preparing and refreshing context during a task</w:t>
+            </w:r>
+          </w:p>
+        </w:tc>
+      </w:tr>
+      <w:tr>
+        <w:trPr>
+          <w:cantSplit/>
+        </w:trPr>
+        <w:tc>
+          <w:tcPr>
+            <w:tcW w:type="dxa" w:w="2088"/>
+            <w:vAlign w:val="center"/>
+            <w:shd w:fill="FFFFFF"/>
+          </w:tcPr>
+          <w:p>
+            <w:pPr>
+              <w:spacing w:after="0" w:line="254" w:lineRule="auto"/>
+            </w:pPr>
+            <w:r>
+              <w:rPr>
+                <w:sz w:val="20"/>
+              </w:rPr>
+              <w:t>Existing foundation</w:t>
+            </w:r>
+          </w:p>
+        </w:tc>
+        <w:tc>
+          <w:tcPr>
+            <w:tcW w:type="dxa" w:w="4032"/>
+            <w:vAlign w:val="center"/>
+            <w:shd w:fill="FFFFFF"/>
+          </w:tcPr>
+          <w:p>
+            <w:pPr>
+              <w:spacing w:after="0" w:line="254" w:lineRule="auto"/>
+            </w:pPr>
+            <w:r>
+              <w:rPr>
+                <w:sz w:val="20"/>
+              </w:rPr>
+              <w:t>Scan, link, base/head PR impact, drift and answer contracts</w:t>
+            </w:r>
+          </w:p>
+        </w:tc>
+        <w:tc>
+          <w:tcPr>
+            <w:tcW w:type="dxa" w:w="4104"/>
+            <w:vAlign w:val="center"/>
+            <w:shd w:fill="FFFFFF"/>
+          </w:tcPr>
+          <w:p>
+            <w:pPr>
+              <w:spacing w:after="0" w:line="254" w:lineRule="auto"/>
+            </w:pPr>
+            <w:r>
+              <w:rPr>
+                <w:sz w:val="20"/>
+              </w:rPr>
+              <w:t>The same engine, graph queries and answer envelope</w:t>
+            </w:r>
+          </w:p>
+        </w:tc>
+      </w:tr>
+      <w:tr>
+        <w:trPr>
+          <w:cantSplit/>
+        </w:trPr>
+        <w:tc>
+          <w:tcPr>
+            <w:tcW w:type="dxa" w:w="2088"/>
+            <w:vAlign w:val="center"/>
+            <w:shd w:fill="F3F5F6"/>
+          </w:tcPr>
+          <w:p>
+            <w:pPr>
+              <w:spacing w:after="0" w:line="254" w:lineRule="auto"/>
+            </w:pPr>
+            <w:r>
+              <w:rPr>
+                <w:sz w:val="20"/>
+              </w:rPr>
+              <w:t>New work</w:t>
+            </w:r>
+          </w:p>
+        </w:tc>
+        <w:tc>
+          <w:tcPr>
+            <w:tcW w:type="dxa" w:w="4032"/>
+            <w:vAlign w:val="center"/>
+            <w:shd w:fill="F3F5F6"/>
+          </w:tcPr>
+          <w:p>
+            <w:pPr>
+              <w:spacing w:after="0" w:line="254" w:lineRule="auto"/>
+            </w:pPr>
+            <w:r>
+              <w:rPr>
+                <w:sz w:val="20"/>
+              </w:rPr>
+              <w:t>Trusted input scope, claim comparison, stored-receipt replay and explicit verdicts</w:t>
+            </w:r>
+          </w:p>
+        </w:tc>
+        <w:tc>
+          <w:tcPr>
+            <w:tcW w:type="dxa" w:w="4104"/>
+            <w:vAlign w:val="center"/>
+            <w:shd w:fill="F3F5F6"/>
+          </w:tcPr>
+          <w:p>
+            <w:pPr>
+              <w:spacing w:after="0" w:line="254" w:lineRule="auto"/>
+            </w:pPr>
+            <w:r>
+              <w:rPr>
+                <w:sz w:val="20"/>
+              </w:rPr>
+              <w:t>Witness selection, token accounting, source expansion and session lifecycle</w:t>
+            </w:r>
+          </w:p>
+        </w:tc>
+      </w:tr>
+      <w:tr>
+        <w:trPr>
+          <w:cantSplit/>
+        </w:trPr>
+        <w:tc>
+          <w:tcPr>
+            <w:tcW w:type="dxa" w:w="2088"/>
+            <w:vAlign w:val="center"/>
+            <w:shd w:fill="FFFFFF"/>
+          </w:tcPr>
+          <w:p>
+            <w:pPr>
+              <w:spacing w:after="0" w:line="254" w:lineRule="auto"/>
+            </w:pPr>
+            <w:r>
+              <w:rPr>
+                <w:sz w:val="20"/>
+              </w:rPr>
+              <w:t>Success evidence</w:t>
+            </w:r>
+          </w:p>
+        </w:tc>
+        <w:tc>
+          <w:tcPr>
+            <w:tcW w:type="dxa" w:w="4032"/>
+            <w:vAlign w:val="center"/>
+            <w:shd w:fill="FFFFFF"/>
+          </w:tcPr>
+          <w:p>
+            <w:pPr>
+              <w:spacing w:after="0" w:line="254" w:lineRule="auto"/>
+            </w:pPr>
+            <w:r>
+              <w:rPr>
+                <w:sz w:val="20"/>
+              </w:rPr>
+              <w:t>Correct scoped verdicts, useful counterexamples, review effort</w:t>
+            </w:r>
+          </w:p>
+        </w:tc>
+        <w:tc>
+          <w:tcPr>
+            <w:tcW w:type="dxa" w:w="4104"/>
+            <w:vAlign w:val="center"/>
+            <w:shd w:fill="FFFFFF"/>
+          </w:tcPr>
+          <w:p>
+            <w:pPr>
+              <w:spacing w:after="0" w:line="254" w:lineRule="auto"/>
+            </w:pPr>
+            <w:r>
+              <w:rPr>
+                <w:sz w:val="20"/>
+              </w:rPr>
+              <w:t>Cost per accepted task and quality relative to the same verifier without a compiler</w:t>
+            </w:r>
+          </w:p>
+        </w:tc>
+      </w:tr>
+      <w:tr>
+        <w:trPr>
+          <w:cantSplit/>
+        </w:trPr>
+        <w:tc>
+          <w:tcPr>
+            <w:tcW w:type="dxa" w:w="2088"/>
+            <w:vAlign w:val="center"/>
+            <w:shd w:fill="F3F5F6"/>
+          </w:tcPr>
+          <w:p>
+            <w:pPr>
+              <w:spacing w:after="0" w:line="254" w:lineRule="auto"/>
+            </w:pPr>
+            <w:r>
+              <w:rPr>
+                <w:sz w:val="20"/>
+              </w:rPr>
+              <w:t>Release dependency</w:t>
+            </w:r>
+          </w:p>
+        </w:tc>
+        <w:tc>
+          <w:tcPr>
+            <w:tcW w:type="dxa" w:w="4032"/>
+            <w:vAlign w:val="center"/>
+            <w:shd w:fill="F3F5F6"/>
+          </w:tcPr>
+          <w:p>
+            <w:pPr>
+              <w:spacing w:after="0" w:line="254" w:lineRule="auto"/>
+            </w:pPr>
+            <w:r>
+              <w:rPr>
+                <w:sz w:val="20"/>
+              </w:rPr>
+              <w:t>Can release without context compilation</w:t>
+            </w:r>
+          </w:p>
+        </w:tc>
+        <w:tc>
+          <w:tcPr>
+            <w:tcW w:type="dxa" w:w="4104"/>
+            <w:vAlign w:val="center"/>
+            <w:shd w:fill="F3F5F6"/>
+          </w:tcPr>
+          <w:p>
+            <w:pPr>
+              <w:spacing w:after="0" w:line="254" w:lineRule="auto"/>
+            </w:pPr>
+            <w:r>
+              <w:rPr>
+                <w:sz w:val="20"/>
+              </w:rPr>
+              <w:t>Requires shared evidence primitives, not CI posting or signing</w:t>
+            </w:r>
+          </w:p>
+        </w:tc>
+      </w:tr>
+    </w:tbl>
+    <w:p>
+      <w:pPr>
+        <w:spacing w:after="40" w:before="0" w:line="48" w:lineRule="auto"/>
+      </w:pPr>
+      <w:r>
+        <w:rPr>
+          <w:sz w:val="4"/>
+        </w:rPr>
+      </w:r>
+    </w:p>
+    <w:p>
+      <w:r>
+        <w:t>The shared foundation owns source and artifact identity, query/diff identity, derivations, completeness and replay. A context packet references its receipts and adds presentation policy; it must not create competing definitions of truth, freshness or evidence. The current PR command already analyzes losses, but it does not yet verify an agent claim or replay a first-class receipt.</w:t>
+      </w:r>
+    </w:p>
+    <w:p>
+      <w:r>
+        <w:t>A snapshot hash is not an answer hash. Base/head scope, query parameters, analysis limits, configuration and engine identity must be bound separately. A token budget may shorten presentation but must not silently remove a contradiction from adjudication. A signed receipt authenticates its issuer, not its semantic correctness.</w:t>
+      </w:r>
+    </w:p>
+    <w:p>
+      <w:r>
+        <w:t>Deliver the shared RWC-02/03/06 work and the verification-specific AV-01/02 adapters first. Run the RWC-01 baseline alongside them. Use full replay initially; selective invalidation and context ranking are not required for an honest verifier. If only one new capability can be funded, choose verification and leave the compiler gated on evaluation.</w:t>
+      </w:r>
+    </w:p>
+    <w:p>
+      <w:r>
+        <w:t>This changes the earlier compiler-first sequencing. It preserves the cost-reduction research direction while recognizing that PR analysis already exists and that both branches need the same dependable inputs. Existing task statuses and public APIs are unchanged by this plan.</w:t>
       </w:r>
     </w:p>
     <w:p>
@@ -1552,7 +2054,17 @@
         <w:t>AnswerEnvelope</w:t>
       </w:r>
       <w:r>
-        <w:t xml:space="preserve"> carries status, snapshot, scope, completeness and freshness. Snapshot identity includes repository revisions and engine/configuration identity. The facade loads a graph once and answers subsequent queries from that in-memory state. These are building blocks for RWC, not evidence that RWC already exists.</w:t>
+        <w:t xml:space="preserve"> carries status, snapshot, scope, completeness and freshness. The facade loads a graph once and answers from memory. The CLI already compares base/head artifacts through </w:t>
+      </w:r>
+      <w:r>
+        <w:rPr>
+          <w:rFonts w:ascii="Courier New" w:hAnsi="Courier New"/>
+          <w:sz w:val="20"/>
+        </w:rPr>
+        <w:t>pr</w:t>
+      </w:r>
+      <w:r>
+        <w:t>; that analysis is reused by the proposed verifier. Neither a first-class receipt verifier nor RWC is established by those primitives alone.</w:t>
       </w:r>
       <w:r>
         <w:rPr>
@@ -1709,7 +2221,7 @@
               <w:rPr>
                 <w:sz w:val="20"/>
               </w:rPr>
-              <w:t>Claims, joins, typed graph answers and derivations</w:t>
+              <w:t>Claims, joins, typed graph answers and base/head impact</w:t>
             </w:r>
           </w:p>
         </w:tc>
@@ -1750,7 +2262,7 @@
               <w:rPr>
                 <w:sz w:val="20"/>
               </w:rPr>
-              <w:t>New pure query services</w:t>
+              <w:t>Shared receipt and query services</w:t>
             </w:r>
           </w:p>
         </w:tc>
@@ -1768,7 +2280,7 @@
               <w:rPr>
                 <w:sz w:val="20"/>
               </w:rPr>
-              <w:t>Obligation results, evidence bundles and dependency manifests</w:t>
+              <w:t>Evidence bundles, scoped verdicts, replay and dependency manifests</w:t>
             </w:r>
           </w:p>
         </w:tc>
@@ -1786,7 +2298,7 @@
               <w:rPr>
                 <w:sz w:val="20"/>
               </w:rPr>
-              <w:t>Accept explicit inputs; no filesystem, network or clock reads.</w:t>
+              <w:t>One implementation for verifier and compiler; explicit inputs only.</w:t>
             </w:r>
           </w:p>
         </w:tc>
@@ -1955,7 +2467,7 @@
     </w:p>
     <w:p>
       <w:r>
-        <w:t>The existing release plan already contains receipts, bounded packs, incremental invalidation and optional host selection. Extend CTX-005, CTX-006, CTX-007, INT-004 and CTX-012 rather than create a competing implementation. The local contract check passed 41 tests across answer, facade and completeness tests; this is not an agent-cost or runtime-accuracy benchmark.</w:t>
+        <w:t>The existing release plan already contains receipts, bounded packs, incremental invalidation and optional host selection. Extend CTX-005, CTX-006, CTX-007, INT-004 and CTX-012 rather than create a competing implementation. An earlier contract check passed 41 tests across answer, facade and completeness tests; this is not an agent-cost or runtime-accuracy benchmark.</w:t>
       </w:r>
     </w:p>
     <w:p>
@@ -3133,7 +3645,7 @@
         <w:br/>
         <w:t xml:space="preserve">  "packet_version": "experimental-1", "snapshot_id": "snapshot-A",</w:t>
         <w:br/>
-        <w:t xml:space="preserve">  "query_id": "orders-migration-A", "status": "needs_more_evidence",</w:t>
+        <w:t xml:space="preserve">  "analysis_receipt_ref": "receipt-A", "status": "needs_more_evidence",</w:t>
         <w:br/>
         <w:t xml:space="preserve">  "facts": [{"id": "F1", "witness_ref": "W1"}],</w:t>
         <w:br/>
@@ -3577,7 +4089,7 @@
     </w:p>
     <w:p>
       <w:r>
-        <w:t>Give each arm the same task, model version, host, repository access, permissions, timeout and output allowance. Compare a well-tuned search/caching baseline A, current TraceKite B, and RWC C. Include a suitable external context/pruning tool where feasible; otherwise limit the competitive claim.</w:t>
+        <w:t>Use identical tasks, models, access and budgets. Compare tuned search/caching A, current TraceKite tools B, and B plus RWC C. Apply the same verifier and acceptance policy to all arms and count its costs. C versus B isolates the compiler's value. Include an external context baseline where feasible; otherwise limit the claim.</w:t>
       </w:r>
     </w:p>
     <w:p>
@@ -3595,7 +4107,7 @@
     </w:p>
     <w:p>
       <w:r>
-        <w:t>Include ordinary single-file fixes, cross-repository API changes, configuration rewrites, shared-library upgrades, newly added consumers, alternative providers, unsupported patterns, dirty trees and high-degree graphs. Hold out repositories and change families, not just random files. Do not use reference patches or hidden tests to construct the agent's context.</w:t>
+        <w:t>Include single-file fixes, cross-repository API/configuration changes, library upgrades, new consumers, alternative providers, unsupported patterns, dirty trees and high-degree graphs. Hold out repositories and change families. Keep reference patches and hidden tests out of agent context.</w:t>
       </w:r>
     </w:p>
     <w:p>
@@ -3620,7 +4132,7 @@
     </w:p>
     <w:p>
       <w:r>
-        <w:t>Start with zero-LLM deterministic fixtures. Then run ten tasks with one host and two arms as a 20-run feasibility check. If that survives, a 30-task pilot with two hosts, three arms and two repetitions requires 360 runs. At an explicitly assumed $2–$10 per run, that pilot would cost $720–$3600 before setup and human review. This document authorizes no paid runs.</w:t>
+        <w:t>Start with offline fixtures, then a 20-run check: ten tasks, one host, two arms. If viable, 30 tasks with two hosts, three arms and two repetitions require 360 runs. At an assumed $2–$10 per run, the pilot costs $720–$3600 before setup and review. No paid runs are authorized here.</w:t>
       </w:r>
     </w:p>
     <w:p>
@@ -3819,7 +4331,7 @@
               <w:rPr>
                 <w:sz w:val="19"/>
               </w:rPr>
-              <w:t>Cost ledger and strong baseline. Start first; extend REL-008.</w:t>
+              <w:t>Quality and cost baseline. Extend REL-008.</w:t>
             </w:r>
           </w:p>
         </w:tc>
@@ -3837,7 +4349,7 @@
               <w:rPr>
                 <w:sz w:val="19"/>
               </w:rPr>
-              <w:t>Provider usage reconciles to priced categories; failed attempts remain counted.</w:t>
+              <w:t>Separate verifier review value from compiler economics; count failed attempts and verification costs.</w:t>
             </w:r>
           </w:p>
         </w:tc>
@@ -3937,7 +4449,7 @@
               <w:rPr>
                 <w:sz w:val="19"/>
               </w:rPr>
-              <w:t>Typed obligations and witness bundles. After 02; extend INT-002.</w:t>
+              <w:t>Shared receipts, typed analysis and replay. After 02; extend CTX-005/006 and INT-002.</w:t>
             </w:r>
           </w:p>
         </w:tc>
@@ -3955,7 +4467,7 @@
               <w:rPr>
                 <w:sz w:val="19"/>
               </w:rPr>
-              <w:t>Supported facts retain all derivation premises; ambiguity and gaps remain explicit.</w:t>
+              <w:t>Query/diff identity is explicit; witnesses and gaps survive replay; no duplicate verifier.</w:t>
             </w:r>
           </w:p>
         </w:tc>
@@ -4114,7 +4626,7 @@
               <w:rPr>
                 <w:sz w:val="19"/>
               </w:rPr>
-              <w:t>Negotiated compact encoding. After 03; extend INT-003.</w:t>
+              <w:t>Versioned receipt interfaces and compact encoding. After 03; extend INT-003.</w:t>
             </w:r>
           </w:p>
         </w:tc>
@@ -4132,7 +4644,7 @@
               <w:rPr>
                 <w:sz w:val="19"/>
               </w:rPr>
-              <w:t>Old clients still work; new clients retain every required warning without duplicate result bodies.</w:t>
+              <w:t>Legacy readers work; new interfaces preserve verdicts, witnesses and warnings.</w:t>
             </w:r>
           </w:p>
         </w:tc>
@@ -4350,7 +4862,7 @@
               <w:rPr>
                 <w:sz w:val="19"/>
               </w:rPr>
-              <w:t>Release decision and second host. After 09.</w:t>
+              <w:t>Compiler release decision and second host. After 09.</w:t>
             </w:r>
           </w:p>
         </w:tc>
@@ -4368,7 +4880,7 @@
               <w:rPr>
                 <w:sz w:val="19"/>
               </w:rPr>
-              <w:t>Confirmatory evidence supports the stated workload; install, compatibility and security gates pass.</w:t>
+              <w:t>Confirmatory evidence supports the compiler workload; install, compatibility and security gates pass.</w:t>
             </w:r>
           </w:p>
         </w:tc>
@@ -4394,12 +4906,12 @@
     </w:p>
     <w:p>
       <w:r>
-        <w:t>Complete RWC-01 and RWC-02, then build the smallest provider–gateway–consumer witness path for RWC-03. Use a full-snapshot cache first. Implement selective guards only when the correctness fixtures and timing show why they matter. This avoids making the hardest optimization a prerequisite for learning whether the product helps agents.</w:t>
+        <w:t>Build shared RWC-02/03/06 and verification-specific AV-01/02 first, with RWC-01 measurement alongside. AV-01 compares explicit claims using trusted scope; AV-02 integrates CI policy and adversarial evaluation. Their detailed acceptance lives in the verification design. Full replay is sufficient for the first verifier; optional RWC-04/05/07/08 follows later.</w:t>
       </w:r>
     </w:p>
     <w:p>
       <w:r>
-        <w:t>Do not train a model, build a hosted fleet or publish savings claims during this milestone. The first decision is whether the ten-task feasibility check shows a credible same-model benefit. Maintain a path back to ordinary source search when the evidence layer cannot answer.</w:t>
+        <w:t>Do not train a model or build a hosted fleet during this milestone. A verifier may release independently after its correctness and integration gates. The compiler's later ten-task check tests same-model benefit against that foundation. Preserve ordinary source inspection when evidence is insufficient.</w:t>
       </w:r>
     </w:p>
     <w:p>
@@ -4485,12 +4997,12 @@
     </w:p>
     <w:p>
       <w:r>
-        <w:t>Proceed with the narrow Evidence Compiler experiment. Make the new-consumer invalidation example and full cost accounting its defining demonstrations. Keep the broad ambition: a reusable code-evidence layer that lets different agents spend more of their budget on the actual change. Earn that position through measured outcomes rather than a worldwide-first claim.</w:t>
+        <w:t>Proceed with a shared evidence foundation and scoped verification first. Test the optional compiler using new-consumer invalidation and full cost accounting. The ambition remains reusable code evidence across agents. Verification claims require their own acceptance evidence, and compiler savings require a separate controlled comparison.</w:t>
       </w:r>
     </w:p>
     <w:p>
       <w:r>
-        <w:t>The next authorized engineering step should be RWC-01 and RWC-02, followed by the bounded RWC-03 prototype. A successful pilot would justify deeper algorithm work and a second integration. A negative pilot should lead to a smaller scope or a stop, not a renamed promise.</w:t>
+        <w:t>Begin RWC-02/03/06 and AV-01/02 with RWC-01 measurement. A successful compiler pilot later justifies deeper selection work; a negative pilot leaves the useful verifier intact. These are stages of one product, not two competing engines or a requirement to ship both at once.</w:t>
       </w:r>
     </w:p>
     <w:p>
@@ -4523,7 +5035,7 @@
       <w:r>
         <w:t xml:space="preserve"> </w:t>
       </w:r>
-      <w:hyperlink r:id="rId10">
+      <w:hyperlink r:id="rId11">
         <w:r>
           <w:rPr>
             <w:color w:val="254C69"/>
@@ -4549,7 +5061,7 @@
       <w:r>
         <w:t xml:space="preserve"> </w:t>
       </w:r>
-      <w:hyperlink r:id="rId11">
+      <w:hyperlink r:id="rId12">
         <w:r>
           <w:rPr>
             <w:color w:val="254C69"/>
@@ -4575,7 +5087,7 @@
       <w:r>
         <w:t xml:space="preserve"> </w:t>
       </w:r>
-      <w:hyperlink r:id="rId12">
+      <w:hyperlink r:id="rId13">
         <w:r>
           <w:rPr>
             <w:color w:val="254C69"/>
@@ -4601,7 +5113,7 @@
       <w:r>
         <w:t xml:space="preserve"> </w:t>
       </w:r>
-      <w:hyperlink r:id="rId13">
+      <w:hyperlink r:id="rId14">
         <w:r>
           <w:rPr>
             <w:color w:val="254C69"/>
@@ -4627,7 +5139,7 @@
       <w:r>
         <w:t xml:space="preserve"> </w:t>
       </w:r>
-      <w:hyperlink r:id="rId14">
+      <w:hyperlink r:id="rId15">
         <w:r>
           <w:rPr>
             <w:color w:val="254C69"/>
@@ -4653,7 +5165,7 @@
       <w:r>
         <w:t xml:space="preserve"> </w:t>
       </w:r>
-      <w:hyperlink r:id="rId15">
+      <w:hyperlink r:id="rId16">
         <w:r>
           <w:rPr>
             <w:color w:val="254C69"/>
@@ -4665,7 +5177,7 @@
       <w:r>
         <w:t xml:space="preserve"> · </w:t>
       </w:r>
-      <w:hyperlink r:id="rId16">
+      <w:hyperlink r:id="rId17">
         <w:r>
           <w:rPr>
             <w:color w:val="254C69"/>
@@ -4691,7 +5203,7 @@
       <w:r>
         <w:t xml:space="preserve"> </w:t>
       </w:r>
-      <w:hyperlink r:id="rId17">
+      <w:hyperlink r:id="rId18">
         <w:r>
           <w:rPr>
             <w:color w:val="254C69"/>
@@ -4717,7 +5229,7 @@
       <w:r>
         <w:t xml:space="preserve"> </w:t>
       </w:r>
-      <w:hyperlink r:id="rId18">
+      <w:hyperlink r:id="rId19">
         <w:r>
           <w:rPr>
             <w:color w:val="254C69"/>
@@ -4743,7 +5255,7 @@
       <w:r>
         <w:t xml:space="preserve"> </w:t>
       </w:r>
-      <w:hyperlink r:id="rId19">
+      <w:hyperlink r:id="rId20">
         <w:r>
           <w:rPr>
             <w:color w:val="254C69"/>
@@ -4769,7 +5281,7 @@
       <w:r>
         <w:t xml:space="preserve"> </w:t>
       </w:r>
-      <w:hyperlink r:id="rId20">
+      <w:hyperlink r:id="rId21">
         <w:r>
           <w:rPr>
             <w:color w:val="254C69"/>
@@ -4795,7 +5307,7 @@
       <w:r>
         <w:t xml:space="preserve"> </w:t>
       </w:r>
-      <w:hyperlink r:id="rId21">
+      <w:hyperlink r:id="rId22">
         <w:r>
           <w:rPr>
             <w:color w:val="254C69"/>
@@ -4807,7 +5319,7 @@
       <w:r>
         <w:t xml:space="preserve"> · </w:t>
       </w:r>
-      <w:hyperlink r:id="rId22">
+      <w:hyperlink r:id="rId23">
         <w:r>
           <w:rPr>
             <w:color w:val="254C69"/>
@@ -4819,7 +5331,7 @@
       <w:r>
         <w:t xml:space="preserve"> · </w:t>
       </w:r>
-      <w:hyperlink r:id="rId23">
+      <w:hyperlink r:id="rId24">
         <w:r>
           <w:rPr>
             <w:color w:val="254C69"/>
@@ -4845,7 +5357,7 @@
       <w:r>
         <w:t xml:space="preserve"> </w:t>
       </w:r>
-      <w:hyperlink r:id="rId24">
+      <w:hyperlink r:id="rId25">
         <w:r>
           <w:rPr>
             <w:color w:val="254C69"/>
@@ -4866,7 +5378,7 @@
         <w:t xml:space="preserve">13. </w:t>
       </w:r>
       <w:r>
-        <w:t>TraceKite source review, September 13 2026. Initial snapshot 417bf80; relevant source and normative documents were unchanged when rechecked at acfbd666d5b2953b28c2c4ac6a75d46a2ff0f260. Relevant files: backend/tracekite/answer.py lines 92–121 and 124–198; facade.py lines 144–188; mcp_envelope.py lines 97–114; source_meta.py lines 39–65 and 116–158; services/evidence_reverify.py lines 25–52; docs/design/architecture.md sections 1–2; docs/design/intelligence-release-plan.md; tasks.csv. Initial contract validation passed 41 tests in test_answer_contract.py, test_facade.py and test_completeness.py. No application changes were made for this report.</w:t>
+        <w:t>TraceKite source baseline 7884982, reviewed September 13 2026; the verification proposal was recorded in 02c1d38. Relevant files: backend/tracekite/answer.py, facade.py, mcp_envelope.py, cli_inspect.py (cmd_pr), services/linker/impact.py, services/evidence_reverify.py and docs/design/architecture.md. The shared proposed contract is docs/design/agent-verification-layer.md. The alignment review passed 72 focused tests covering impact, CLI, packaging and answer contracts. Documentation and docstrings are corrected separately from executable behavior; the proposed verifier and compiler remain unimplemented.</w:t>
       </w:r>
     </w:p>
     <w:p>
@@ -4885,7 +5397,7 @@
       <w:r>
         <w:t xml:space="preserve"> </w:t>
       </w:r>
-      <w:hyperlink r:id="rId25">
+      <w:hyperlink r:id="rId26">
         <w:r>
           <w:rPr>
             <w:color w:val="254C69"/>
@@ -4897,7 +5409,7 @@
       <w:r>
         <w:t xml:space="preserve"> · </w:t>
       </w:r>
-      <w:hyperlink r:id="rId26">
+      <w:hyperlink r:id="rId27">
         <w:r>
           <w:rPr>
             <w:color w:val="254C69"/>
@@ -5245,7 +5757,7 @@
         <w:t xml:space="preserve"> </w:t>
       </w:r>
       <w:r>
-        <w:t xml:space="preserve">TraceKite source rechecked at acfbd66; source files and validation details appear in Sources.</w:t>
+        <w:t xml:space="preserve">TraceKite source at 7884982; PR analysis and shared-contract references appear in Sources.</w:t>
       </w:r>
     </w:p>
   </w:footnote>

</xml_diff>